<commit_message>
Correct literature review against full-text articles
Co-Authored-By: Claude Opus 5.5 <noreply@anthropic.com>
Claude-Session: https://claude.ai/code/session_01PCrLuLuf13bgHFN1Akf9GB
</commit_message>
<xml_diff>
--- a/seminar/מטלת ביניים - סקירת ספרות - חיתאם אבו ריאש.docx
+++ b/seminar/מטלת ביניים - סקירת ספרות - חיתאם אבו ריאש.docx
@@ -729,7 +729,7 @@
           <w:szCs w:val="24"/>
           <w:rtl/>
         </w:rPr>
-        <w:t xml:space="preserve">לצד המושג "קהילה" מופיע בספרות המושג "קהילתיות", המתאר את איכות הקשר שבין חברי הקהילה. פישר ורפאל פניו (Fisher &amp; Refael Fanyo, 2022) מגדירים קהילתיות כמידה גבוהה של אמון והדדיות בין חברי הקהילה, וכן בינם ובין המוסדות והדמויות המשמעותיות בה. ההגדרה כוללת גם מודעות פנימית לקולקטיב, שמבחינה בין מי ששייך לקהילה ובין מי שמחוצה לה. ההגדרה הזאת חשובה לעבודה הנוכחית, משום שהיא מציבה את המוסדות, ובהם בית הספר, בתוך רשת היחסים הקהילתית ולא מחוצה לה.</w:t>
+        <w:t xml:space="preserve">בספרות העכשווית קהילה מתוארת כמערכת חברתית שמקיימת תקשורת והדדיות ברוב תחומי החיים, ויכולה להתקיים בכל צורת יישוב. לקהילה יש ממד טריטוריאלי, המאפשר מפגש פנים אל פנים ומשפיע על רמת האמון ועל אופי היחסים בין חבריה, ולחבריה יש מודעות קולקטיבית פנימית שמבחינה אותם מסביבתם. עם זאת, הקהילות החדשות פלורליסטיות, ומשלבות אינדיבידואליזם וחירות עם אחריות הדדית ומחויבות לקבוצה (Fisher &amp; Refael Fanyo, 2022). לצד המושג "קהילה" מופיע המושג "קהילתיות", המתאר את איכות החיים בתוך הקהילה. קהילתיות נמדדת בתחושת זהות משותפת, באמון וביחסי הגומלין בין חברי הקהילה, ובנכונותם לפעול למען אחרים ולשתף אותם בחייהם. קהילתיות גבוהה מעידה על אמון והדדיות לא רק בין החברים עצמם, אלא גם בינם ובין המוסדות והדמויות המייצגות בקהילה, ובית הספר והמורים נמנים עליהם (שדמי-וורטמן, 2017, כפי שמצוטט אצל Fisher &amp; Refael Fanyo, 2022). ההגדרה הזאת חשובה לעבודה הנוכחית, משום שהיא מציבה את בית הספר בתוך רשת היחסים הקהילתית ולא מחוצה לה.</w:t>
       </w:r>
     </w:p>
     <w:p>
@@ -799,7 +799,7 @@
           <w:szCs w:val="24"/>
           <w:rtl/>
         </w:rPr>
-        <w:t xml:space="preserve">בית הספר הוא מקום של הוראה ולמידה, אך הוא גם קהילה שחבריה הם מורים, תלמידים והורים, והוא נטוע בקהילה הרחבה של השכונה והעיר. מודל שיתוף הפעולה הקהילתי (Community Collaboration Model) מציע לשפר את בית הספר באמצעות שותפויות עם משפחות ועם גורמים בקהילה, שמטרתן להסיר חסמים ללמידה שאינם לימודיים במהותם. סקירת היקף של 14 מאמרים שפיטים שעסקו ביישום המודל מצאה כי הוא נקשר לנגישות רבה יותר לשירותי בריאות הנפש, לשיפור באקלים הבית ספרי ולירידה בהפניות משמעתיות. שותפות עם אוניברסיטאות סייעה ליישום, ואילו התנגדות ראשונית של אנשי חינוך הייתה אחד החסמים העיקריים (Anderson-Butcher et al., 2022).</w:t>
+        <w:t xml:space="preserve">בית הספר הוא מקום של הוראה ולמידה, אך הוא גם קהילה שחבריה הם מורים, תלמידים והורים, והוא נטוע בקהילה הרחבה של השכונה והעיר. מודל שיתוף הפעולה הקהילתי (Community Collaboration Model) מציע לשפר את בית הספר באמצעות שותפויות עם משפחות ועם גורמים בקהילה, שמטרתן להסיר חסמים ללמידה שאינם לימודיים במהותם, כמו חוסר ביטחון תזונתי, אלימות במשפחה או קשיים בבריאות הנפש. המודל בוחן צרכים ומשאבים בחמישה נתיבים: למידה אקדמית, התפתחות נוער ואקלים בית ספרי, מעורבות הורים ומשפחות, שירותי בריאות ורווחה ושותפויות קהילתיות. יישומו מתחיל במיפוי הצרכים של כל קבוצות השותפים, ובהן התלמידים, הצוות, ההורים ותושבי הקהילה. סקירת היקף של 14 מאמרים שפיטים שעסקו ביישום המודל מצאה כי הוא נקשר לנגישות רבה יותר לשירותי בריאות הנפש, לשיפור באקלים הבית ספרי ולירידה בהפניות משמעתיות. שותפות עם אוניברסיטאות סייעה ליישום, ואילו התנגדות ראשונית של אנשי חינוך הייתה אחד החסמים העיקריים (Anderson-Butcher et al., 2022).</w:t>
       </w:r>
     </w:p>
     <w:p>
@@ -850,7 +850,7 @@
           <w:szCs w:val="24"/>
           <w:rtl/>
         </w:rPr>
-        <w:t xml:space="preserve">גם ההורים נמצאים בתוך רשת היחסים הקהילתית. סקר שנערך בקרב 300 הורים לתלמידים בבתי ספר יסודיים ממלכתיים ברחבי ישראל מצא כי קהילתיות גבוהה ניבאה תפיסה גבוהה יותר של סמכות המורה ומעורבות הורים רבה יותר. לעומת זאת, מגורים באותו אזור שבו גרים המורים ניבאו תפיסת סמכות נמוכה יותר ומעורבות נמוכה יותר (Fisher &amp; Refael Fanyo, 2022). הקרבה הפיזית, אם כן, אינה מבטיחה קרבה חינוכית, ולעיתים היא מטשטשת את הגבולות שבין המורה כאיש מקצוע ובין המורה כשכן. ממצא זה מוביל אל הפרק הבא, העוסק במי שאחראים לעצב את היחסים האלה בפועל: המנהלים והמורים.</w:t>
+        <w:t xml:space="preserve">גם ההורים נמצאים בתוך רשת היחסים הקהילתית. שאלון שמילאו 300 הורים לתלמידים בבתי ספר יסודיים ממלכתיים ברחבי ישראל, רובם מקיבוצים, ממושבים ומיישובים קהילתיים, נותח במודל משוואות מבניות. קהילתיות גבוהה ניבאה תפיסה גבוהה יותר של סמכות המורה (β=0.27) ומעורבות הורים רבה יותר (β=0.30). לעומת זאת, מגורים באותו יישוב או שכונה שבהם גרים המורים ניבאו תפיסת סמכות נמוכה יותר (β=-0.18) ומעורבות נמוכה יותר (β=-0.20). החוקרות הציעו שני הסברים לממצא האחרון. ראשית, מגורים משותפים מאפשרים היכרות עמוקה בין ההורים למורים מעבר ליחסים הפורמליים בבית הספר, וככל שההורים בוטחים יותר במורים, הם זקוקים פחות למעורבות פעילה. שנית, השיחות הבלתי פורמליות "על המדרכה" עשויות לגרום להורים להרגיש שמעורבות נוספת בבית הספר מיותרת (Fisher &amp; Refael Fanyo, 2022). הקרבה הפיזית, אם כן, משנה את אופי הקשר בין הבית לבית הספר, ולא בהכרח מגבירה את המעורבות. ממצא זה מוביל אל הפרק הבא, העוסק במי שאחראים לעצב את היחסים האלה בפועל: המנהלים והמורים.</w:t>
       </w:r>
     </w:p>
     <w:p>
@@ -906,7 +906,7 @@
           <w:szCs w:val="24"/>
           <w:rtl/>
         </w:rPr>
-        <w:t xml:space="preserve">המחקר על מנהיגות בית ספרית עבר בשני העשורים האחרונים מתפיסה של מנהיג יחיד, המנהל, אל תפיסה שלפיה המנהיגות מתרחשת באינטראקציות בין אנשים רבים בבית הספר. סקירה של כעשרים שנות מחקר על מנהיגות מבוזרת, מאז עבודתם של ספילן ועמיתיו (Spillane et al., 2001, כפי שמצוטט אצל Harris et al., 2022), חילקה את הספרות לתקופה מוקדמת (2001 עד 2011) ולתקופה עכשווית (2011 עד 2021). הכותבים ציינו במפורש כי אין מדובר בסקירה שיטתית אלא בבחירה של ראיות, ושאלו אם המושג עדיין רלוונטי. הם הגיעו למסקנה שמנהיגות מבוזרת נקשרת לשיפור בית הספר, ושהיא עדיין מושג שימושי למחקר ולמעשה (Harris et al., 2022).</w:t>
+        <w:t xml:space="preserve">המחקר על מנהיגות בית ספרית עבר בשני העשורים האחרונים מתפיסה של מנהיג יחיד, המנהל, אל תפיסה של מנהיגות משותפת, "מתוחה" בין בעלי תפקידים פורמליים ובלתי פורמליים. נקודת המוצא לתפיסה הזאת הייתה עבודתם של ספילן ועמיתיו (Spillane et al., 2001, כפי שמצוטט אצל Harris et al., 2022). סקירה של עשרים שנות מחקר על מנהיגות מבוזרת חילקה את הספרות לתקופה מוקדמת (2001 עד 2011) ולתקופה עכשווית (2011 עד 2021), שממנה נבחרו 43 מאמרים. הכותבים ציינו במפורש כי אין מדובר בסקירה שיטתית אלא בבחירה של ראיות. הם מצאו כי מנהיגות מבוזרת היא, לצד המנהיגות הפדגוגית והמנהיגות המעצבת, אחד ממודלי המנהיגות הנחקרים ביותר. הראיות העדכניות חיזקו שתי טענות: שלמנהיגות בית ספרית יש השפעה חיובית במיוחד על בית הספר ועל התלמידים כאשר היא מבוזרת, ושיש דפוסי ביזור יעילים יותר מאחרים. עם זאת, לדבריהם, "הקופסה השחורה" של המנהיגות המבוזרת פתוחה רק בחלקה, ונדרשים מחקרי אורך רחבי היקף שישלבו כמה שיטות (Harris et al., 2022).</w:t>
       </w:r>
     </w:p>
     <w:p>
@@ -1049,7 +1049,7 @@
           <w:szCs w:val="24"/>
           <w:rtl/>
         </w:rPr>
-        <w:t xml:space="preserve">ההנחה שמעורבות הורים מועילה לתלמידים זכתה לתמיכה מחקרית, אך התמונה מורכבת יותר משנהוג לחשוב. מטה-אנליזה של 55 מחקרים בלתי תלויים שפורסמו בין 2010 ל-2019 מצאה כי השפעתה הכוללת של מעורבות ההורים על ההישגים הלימודיים חיובית אך קטנה. לציפיות של ההורים הייתה ההשפעה הגדולה ביותר, ואילו לשליטה הורית נמצאה השפעה שלילית קטנה. ההשפעה לא השתנתה לפי שלב הלימודים, סוג המדידה או תחום הדעת, אך היא השתנתה לפי רמת הפיתוח של המדינה שבה נערך המחקר (Erdem &amp; Kaya, 2020). מכאן שלא כל מעורבות מועילה באותה מידה. הורה שמביע ציפיות ומעודד תורם יותר מהורה שמפקח ובודק.</w:t>
+        <w:t xml:space="preserve">ההנחה שמעורבות הורים מועילה לתלמידים זכתה לתמיכה מחקרית, אך התמונה מורכבת יותר משנהוג לחשוב. מטה-אנליזה של 55 מחקרים בלתי תלויים שפורסמו בין 2010 ל-2019 מצאה כי השפעתה הכוללת של מעורבות ההורים על ההישגים הלימודיים חיובית אך קטנה (r=.09). לציפיות של ההורים הייתה ההשפעה הגדולה ביותר, ואילו לשליטה הורית נמצאה השפעה שלילית קטנה. ההשפעה לא השתנתה לפי שלב הלימודים, סוג המדידה או תחום הדעת, אך היא השתנתה לפי רמת הפיתוח של המדינה שבה נערך המחקר: במדינות מתפתחות היא הייתה גדולה יותר (r=.13) מאשר במדינות מפותחות (r=.07). גם לתקשורת בין ההורים לילד על הלימודים נמצאה השפעה קטנה (Erdem &amp; Kaya, 2020). מכאן שלא כל מעורבות מועילה באותה מידה. הורה שמביע ציפיות ומעודד תורם יותר מהורה שמפקח ובודק.</w:t>
       </w:r>
     </w:p>
     <w:p>
@@ -1262,24 +1262,41 @@
           <w:szCs w:val="24"/>
           <w:rtl/>
         </w:rPr>
-        <w:t xml:space="preserve">לוד היא אחת הערים המעורבות בישראל, ערים שבהן חיים יהודים וערבים באותו מרחב עירוני. לפי מרכז המחקר והמידע של הכנסת, בסוף 2019 חיו בערים המעורבות כ-490 אלף תושבים ערבים, ובירושלים, בלוד, בעכו וברמלה מהווים התלמידים הערבים כ-30% ממערכת החינוך (אבגר ואחרים, 2021). בלוד עצמה היוו הערבים בסוף 2020 כ-29.8% מן התושבים, רובם מוסלמים, ובשנים 2018 עד 2019 היה התקציב לתלמיד בחטיבות הביניים היהודיות בעיר גבוה ב-18% מזה שבחטיבות הביניים הערביות (המכון הישראלי לדמוקרטיה, 2022). הנתונים מלמדים שבית ספר בלוד פועל בתוך עיר שבה הפערים בין הקהילות מתבטאים גם במשאבים של מערכת החינוך.</w:t>
-      </w:r>
-    </w:p>
-    <w:p>
-      <w:pPr>
-        <w:bidi/>
-        <w:spacing w:after="0" w:before="0" w:line="480" w:lineRule="auto"/>
-        <w:ind w:firstLine="567"/>
-        <w:jc w:val="both"/>
-      </w:pPr>
-      <w:r>
-        <w:rPr>
-          <w:rFonts w:ascii="Times New Roman" w:cs="David" w:hAnsi="Times New Roman"/>
-          <w:sz w:val="24"/>
-          <w:szCs w:val="24"/>
-          <w:rtl/>
-        </w:rPr>
-        <w:t xml:space="preserve">במאי 2021 הפכה לוד למוקד של אירועי אלימות קשים בין יהודים לערבים. ניתוח שפורסם בכתב העת "עדכן אסטרטגי" תיאר את האירועים בערים המעורבות כהפתעה אסטרטגית עבור הממשלה ומערכת הביטחון, ובחן את הקושי לפרש נכון סימני אזהרה עמומים שקדמו להם (ברנע, 2024). מאמר שנכתב סמוך לאירועים טען כי הם חשפו תהליך מהיר של אתנו-ג'נטריפיקציה בערים המעורבות, ובהן לוד, שמובילים אותו בין השאר הגרעינים התורניים. לפי הטענה, השיח הציבורי על דו-קיום מסתיר פערים מעמדיים ולאומיים, והג'נטריפיקציה מוצגת כהתחדשות עירונית ניטרלית בזמן שהיא מקדמת בפועל שליטה אתנו-לאומית (שמריהו-ישורון, 2021). מחקר מאוחר יותר הרחיב את הטענה וזיהה טיפוס חדש של "מג'נטרף לאומי": משפחות ממעמד הביניים, דתיות-לאומיות, המאורגנות בגרעינים תורניים ושונות הן מהמג'נטרפים החילונים-ליברלים והן מהמתנחלים מעבר לקו הירוק (Shmaryahu-Yeshurun &amp; Monterescu, 2024).</w:t>
+        <w:t xml:space="preserve">לוד היא אחת הערים המעורבות בישראל, ערים שבהן חיים יהודים וערבים באותו מרחב עירוני. לפי סקירה של מרכז המחקר והמידע של הכנסת, בסוף 2019 חיו בלוד 77,224 תושבים, מהם 23,641 ערבים (31%), ו-97% מהתושבים הערבים בעיר מוסלמים. העיר כולה משויכת לאשכול 4 במדד החברתי-כלכלי, אך כל ארבעת האזורים הסטטיסטיים הערביים בה שייכים לאשכולות 1 ו-2, הנמוכים ביותר, ואילו 15 האזורים היהודיים פזורים בין אשכולות 3 ל-6. בלוד, כמו בירושלים, בעכו וברמלה, 30% עד 40% מהתלמידים במערכת החינוך הם ערבים (אבגר ואחרים, 2021).</w:t>
+      </w:r>
+    </w:p>
+    <w:p>
+      <w:pPr>
+        <w:bidi/>
+        <w:spacing w:after="0" w:before="0" w:line="480" w:lineRule="auto"/>
+        <w:ind w:firstLine="567"/>
+        <w:jc w:val="both"/>
+      </w:pPr>
+      <w:r>
+        <w:rPr>
+          <w:rFonts w:ascii="Times New Roman" w:cs="David" w:hAnsi="Times New Roman"/>
+          <w:sz w:val="24"/>
+          <w:szCs w:val="24"/>
+          <w:rtl/>
+        </w:rPr>
+        <w:t xml:space="preserve">הפערים מתבטאים גם במשאבים של מערכת החינוך. לפי אותה סקירה, בבתי הספר היסודיים בלוד תוקצבו בתי ספר בחינוך הערבי בכ-39% פחות מבתי ספר בחינוך העברי שמשתייכים לאותו חמישון טיפוח, ובחטיבה העליונה נמצא פער של 31% לטובת החינוך העברי הממלכתי. במבחני המיצ"ב של כיתות ח' נמצאו בלוד פערים גדולים במיוחד בכל המקצועות לטובת דוברי העברית, ולוד היא אחת משתי הערים המעורבות היחידות שבהן אין קרבה בשיעורי הזכאות לבגרות בין החינוך העברי לחינוך הערבי (אבגר ואחרים, 2021). מכאן שבית ספר בלוד פועל בתוך עיר שבה הפערים בין הקהילות אינם רק תחושה אלא עובדה מדידה.</w:t>
+      </w:r>
+    </w:p>
+    <w:p>
+      <w:pPr>
+        <w:bidi/>
+        <w:spacing w:after="0" w:before="0" w:line="480" w:lineRule="auto"/>
+        <w:ind w:firstLine="567"/>
+        <w:jc w:val="both"/>
+      </w:pPr>
+      <w:r>
+        <w:rPr>
+          <w:rFonts w:ascii="Times New Roman" w:cs="David" w:hAnsi="Times New Roman"/>
+          <w:sz w:val="24"/>
+          <w:szCs w:val="24"/>
+          <w:rtl/>
+        </w:rPr>
+        <w:t xml:space="preserve">במאי 2021 הפכה לוד למוקד של אירועי אלימות קשים בין יהודים לערבים. ניתוח שפורסם בכתב העת "עדכן אסטרטגי" תיאר את האירועים בערים המעורבות כהפתעה אסטרטגית עבור הממשלה ומערכת הביטחון, ובחן את הקושי לפרש נכון סימני אזהרה עמומים שקדמו להם (ברנע, 2024). מאמר שנכתב סמוך לאירועים טען כי הם חשפו תהליך מהיר של אתנו-ג'נטריפיקציה בערים המעורבות, ובהן לוד, שמובילים אותו בין השאר הגרעינים התורניים. לפי הטענה, השיח הציבורי על דו-קיום מסתיר פערים מעמדיים ולאומיים, והג'נטריפיקציה מוצגת כהתחדשות עירונית ניטרלית בזמן שהיא מקדמת בפועל שליטה אתנו-לאומית (שמריהו-ישורון, 2021). מחקר מאוחר יותר, שהתבסס על ראיונות, על תצפית משתתפת ועל ניתוח מסמכים ביפו, הרחיב את הטענה וזיהה טיפוס חדש של "מג'נטרף לאומי": משפחות דתיות-לאומיות המאורגנות בגרעינים תורניים, ושונות הן מהמג'נטרפים החילונים-ליברלים והן מתנועת ההתיישבות מעבר לקו הירוק. החוקרים מציינים כי הגרעין התורני הראשון בעיר מעורבת הוקם דווקא בלוד, ב-1994 (Shmaryahu-Yeshurun &amp; Monterescu, 2024).</w:t>
       </w:r>
     </w:p>
     <w:p>
@@ -1332,41 +1349,41 @@
           <w:szCs w:val="24"/>
           <w:rtl/>
         </w:rPr>
-        <w:t xml:space="preserve">מחקרים שהשוו בין הורים יהודים להורים ערבים בישראל מצאו הבדלים בדפוסי המעורבות. מחקר שנערך בקרב 119 הורים לילדים בגני ילדים, 55 יהודים ו-64 ערבים, בחן את סוגי המעורבות, את טיב הקשר עם הגננת בתקופת הקורונה ואת נכונות הגננת, כפי שההורים תפסו אותה, לשתף אותם. מעורבות ההורים הערבים נמצאה נמוכה מזו של ההורים היהודים. בחינוך הערבי הסוג הנפוץ ביותר היה "צופים", ואחריו "דיאלוג", ואילו בחינוך הממלכתי היהודי הנפוץ ביותר היה "ועדים". בחברה הערבית נקשרה תפיסת הנכונות של הגננת למצב החברתי-כלכלי של המשפחה, ובחברה היהודית לזמינות ולידע של ההורים (בנג'ו ובדיר, 2024). המחקר עסק בגני ילדים ולא בבתי ספר, אך הוא מצביע על כך שאותה מסגרת חינוכית יכולה להיתפס באופן שונה בשתי הקהילות.</w:t>
-      </w:r>
-    </w:p>
-    <w:p>
-      <w:pPr>
-        <w:bidi/>
-        <w:spacing w:after="0" w:before="0" w:line="480" w:lineRule="auto"/>
-        <w:ind w:firstLine="567"/>
-        <w:jc w:val="both"/>
-      </w:pPr>
-      <w:r>
-        <w:rPr>
-          <w:rFonts w:ascii="Times New Roman" w:cs="David" w:hAnsi="Times New Roman"/>
-          <w:sz w:val="24"/>
-          <w:szCs w:val="24"/>
-          <w:rtl/>
-        </w:rPr>
-        <w:t xml:space="preserve">סקר שכלל 121 הורים ערבים ו-192 הורים יהודים לילדים בבית הספר היסודי בחן את דפוסי בקשת העזרה של ההורים מן המורים. ההורים היהודים דיווחו יותר על בקשת עזרה אוטונומית, כזו שמטרתה לפתח את יכולתם להתמודד בעצמם, ואילו ההורים הערבים דיווחו יותר על בקשת עזרה תלותית ועל הימנעות מבקשת עזרה. בשתי הקבוצות, ככל ששיתוף הפעולה בין ההורים למורים היה רב יותר, כך גברה בקשת העזרה האוטונומית. המוצא האתני, תחושת המסוגלות ההורית ושיתוף הפעולה עם המורים ניבאו כולם את דפוס בקשת העזרה (Grinshtain &amp; Harpaz, 2023). המשמעות המעשית היא שמורה שבונה שיתוף פעולה של ממש יכול לעזור להורים לעבור מתלות לשותפות.</w:t>
-      </w:r>
-    </w:p>
-    <w:p>
-      <w:pPr>
-        <w:bidi/>
-        <w:spacing w:after="0" w:before="0" w:line="480" w:lineRule="auto"/>
-        <w:ind w:firstLine="567"/>
-        <w:jc w:val="both"/>
-      </w:pPr>
-      <w:r>
-        <w:rPr>
-          <w:rFonts w:ascii="Times New Roman" w:cs="David" w:hAnsi="Times New Roman"/>
-          <w:sz w:val="24"/>
-          <w:szCs w:val="24"/>
-          <w:rtl/>
-        </w:rPr>
-        <w:t xml:space="preserve">מעורבות ההורים משמעותית במיוחד בקרב משפחות במצבי סיכון. מחקר שהשווה בין 90 מתבגרים שנשרו מבתי ספר בחינוך הערבי הבדואי בנגב, 45 מיישובים מוכרים ו-45 מיישובים לא מוכרים, מצא כי מעורבות ההורים השפיעה באופן מובהק על הנשירה, וכי ילדים שהוריהם מנותקים מלימודיהם נמצאים בסיכון גבוה יותר (אבו עג'אג', 2016). המחקר עוסק באוכלוסייה שונה מזו של לוד, אך הוא מחזק את הטענה שבקהילות מוחלשות הקשר בין הבית לבית הספר הוא גורם מגן.</w:t>
+        <w:t xml:space="preserve">מחקרים שהשוו בין הורים יהודים להורים ערבים בישראל מצאו הבדלים בדפוסי המעורבות, אך התמונה אינה אחידה. בספרות מקובל למיין את סוגי המעורבות על פני רצף לפי מידת האקטיביות של ההורים: צופים, ספקי שירות, לומדים, דיאלוג וועדים. מחקר קודם שבחן את מעורבות ההורים במגזרים השונים מצא כי בחינוך הערבי המעורבות נמוכה יותר, והסוג הנפוץ ביותר בו הוא "צופים", ואילו בחינוך הממלכתי היהודי הנפוץ ביותר הוא "ועדים" (גרינבנק ובנג'ו, 2021, כפי שמצוטט אצל בנג'ו ובדיר, 2024). מחקר מאוחר יותר, שנערך בתקופת הקורונה בקרב 119 הורים לילדים בגני ילדים, 55 יהודים ו-64 ערבים, הגיע לממצא הפוך: בסוגי המעורבות "שירותים", "ועדים" ו"דיאלוג" הייתה מעורבות ההורים הערבים גבוהה מזו של ההורים היהודים, וגם השינוי במעורבותם בתקופת הקורונה היה גדול יותר. החוקרות הסבירו זאת בכך שבגיל הרך נדרשת מעורבות רבה יותר, ובכך שבתקופת הסגרים עברה הלמידה אל הבית, שבו הורים ערבים נוטים להיות מעורבים יותר. בטיב הקשר עם הגננת לא נמצאו הבדלים מובהקים, ובשתי הקבוצות הקשר היה טוב. ההבדל העיקרי היה בהסברים של ההורים: הורים ערבים קשרו את נכונות הגננת לשתף אותם למעמדם החברתי-כלכלי, ואילו הורים יהודים קשרו אותה לזמינות ולידע של ההורים. החוקרות המליצו על סדנאות משותפות לגננות ולהורים משתי החברות, שיאפשרו למידה הדדית (בנג'ו ובדיר, 2024). המחקר עסק בגני ילדים ולא בבתי ספר, אך הוא מלמד שמעורבות ההורים הערבים אינה נמוכה מעצם טבעה, ושהיא משתנה לפי המסגרת ולפי הנסיבות.</w:t>
+      </w:r>
+    </w:p>
+    <w:p>
+      <w:pPr>
+        <w:bidi/>
+        <w:spacing w:after="0" w:before="0" w:line="480" w:lineRule="auto"/>
+        <w:ind w:firstLine="567"/>
+        <w:jc w:val="both"/>
+      </w:pPr>
+      <w:r>
+        <w:rPr>
+          <w:rFonts w:ascii="Times New Roman" w:cs="David" w:hAnsi="Times New Roman"/>
+          <w:sz w:val="24"/>
+          <w:szCs w:val="24"/>
+          <w:rtl/>
+        </w:rPr>
+        <w:t xml:space="preserve">סקר שכלל 121 הורים ערבים ו-192 הורים יהודים לילדים בבית הספר היסודי בחן את דפוסי בקשת העזרה של ההורים מן המורים. ההורים היהודים דיווחו יותר על בקשת עזרה אוטונומית, כזו שמטרתה לפתח את יכולתם להתמודד בעצמם, ואילו ההורים הערבים דיווחו יותר על בקשת עזרה תלותית ועל הימנעות מבקשת עזרה. בשתי הקבוצות, ככל ששיתוף הפעולה בין ההורים למורים היה רב יותר, כך גברה בקשת העזרה האוטונומית. המוצא האתני, תחושת המסוגלות ההורית ושיתוף הפעולה עם המורים ניבאו כולם את דפוס בקשת העזרה. החוקרות המליצו על התערבות מותאמת תרבות, שתעודד הורים ומורים לבנות יחסי עזרה, ובכלל זה הנחיה להורים כיצד לבקש מן המורים עזרה שמטרתה לפתח את יכולתם להתמודד בעצמם (Grinshtain &amp; Harpaz, 2023). המשמעות המעשית היא שמורה שבונה שיתוף פעולה של ממש יכול לעזור להורים לעבור מתלות לשותפות.</w:t>
+      </w:r>
+    </w:p>
+    <w:p>
+      <w:pPr>
+        <w:bidi/>
+        <w:spacing w:after="0" w:before="0" w:line="480" w:lineRule="auto"/>
+        <w:ind w:firstLine="567"/>
+        <w:jc w:val="both"/>
+      </w:pPr>
+      <w:r>
+        <w:rPr>
+          <w:rFonts w:ascii="Times New Roman" w:cs="David" w:hAnsi="Times New Roman"/>
+          <w:sz w:val="24"/>
+          <w:szCs w:val="24"/>
+          <w:rtl/>
+        </w:rPr>
+        <w:t xml:space="preserve">מעורבות ההורים משמעותית במיוחד בקרב משפחות במצבי סיכון. מחקר שהשווה בין 90 מתבגרים שנשרו מבתי ספר בחינוך הערבי הבדואי בנגב, 45 מיישובים מוכרים ו-45 מיישובים לא מוכרים, מצא קשר שלילי מובהק בעוצמה בינונית בין מידת המעורבות של ההורים בנעשה בבית הספר ובין הנטייה לנשירה (R=-0.48). לעומת זאת, בניגוד להשערות החוקר, לא נמצא קשר מובהק בין הנשירה ובין המצב החברתי-כלכלי של המשפחה או השכלת ההורים. מכאן שילד שהוריו מנותקים מלימודיו נמצא בסיכון גבוה יותר לנשור, בלי קשר למעמד המשפחה (אבו עג'אג', 2016). המחקר עוסק באוכלוסייה שונה מזו של לוד, אך הוא מחזק את הטענה שבקהילות מוחלשות הקשר בין הבית לבית הספר הוא גורם מגן.</w:t>
       </w:r>
     </w:p>
     <w:p>
@@ -1420,7 +1437,7 @@
           <w:szCs w:val="24"/>
           <w:rtl/>
         </w:rPr>
-        <w:t xml:space="preserve">בקצה הצר של המשפך עומדת לוד: עיר מעורבת, עם פערים בתקציבי החינוך ועם מתחים שהתפרצו במאי 2021, שבה הורים יהודים והורים ערבים עשויים לבוא אל בית הספר עם ציפיות שונות ועם דפוסי מעורבות שונים (בנג'ו ובדיר, 2024; Grinshtain &amp; Harpaz, 2023). בחיפוש הספרות לא נמצא מחקר שבחן באופן ישיר כיצד מורים בבית ספר בלוד עובדים מול ההורים. זהו הפער שהמחקר הנוכחי מבקש לבחון, באמצעות שאלת המחקר: איך המורים עובדים מול הורים בבית ספר בלוד, ואילו דרכי תקשורת ושיתוף פעולה מאפיינים את הקשר ביניהם?</w:t>
+        <w:t xml:space="preserve">בקצה הצר של המשפך עומדת לוד: עיר מעורבת, עם פערים חברתיים-כלכליים ופערים בתקציבי החינוך בין השכונות היהודיות לערביות (אבגר ואחרים, 2021) ועם מתחים שהתפרצו במאי 2021. בעיר כזאת הורים יהודים והורים ערבים עשויים לבוא אל בית הספר עם ציפיות שונות ועם דפוסי מעורבות שונים, שמשתנים גם לפי הנסיבות (בנג'ו ובדיר, 2024; Grinshtain &amp; Harpaz, 2023). בחיפוש הספרות לא נמצא מחקר שבחן באופן ישיר כיצד מורים בבית ספר בלוד עובדים מול ההורים. זהו הפער שהמחקר הנוכחי מבקש לבחון, באמצעות שאלת המחקר: איך המורים עובדים מול הורים בבית ספר בלוד, ואילו דרכי תקשורת ושיתוף פעולה מאפיינים את הקשר ביניהם?</w:t>
       </w:r>
     </w:p>
     <w:p>
@@ -1477,7 +1494,7 @@
           <w:szCs w:val="24"/>
           <w:rtl/>
         </w:rPr>
-        <w:t xml:space="preserve">. הכנסת, מרכז המחקר והמידע.</w:t>
+        <w:t xml:space="preserve"> [סקירה ראשונית]. הכנסת, מרכז המחקר והמידע.</w:t>
       </w:r>
     </w:p>
     <w:p>
@@ -1885,43 +1902,6 @@
           <w:rtl/>
         </w:rPr>
         <w:t xml:space="preserve">, 189-210.</w:t>
-      </w:r>
-    </w:p>
-    <w:p>
-      <w:pPr>
-        <w:bidi/>
-        <w:spacing w:line="480" w:lineRule="auto"/>
-        <w:ind w:start="709" w:hanging="709"/>
-        <w:jc w:val="start"/>
-      </w:pPr>
-      <w:r>
-        <w:rPr>
-          <w:rFonts w:ascii="Times New Roman" w:cs="David" w:hAnsi="Times New Roman"/>
-          <w:sz w:val="24"/>
-          <w:szCs w:val="24"/>
-          <w:rtl/>
-        </w:rPr>
-        <w:t xml:space="preserve">המכון הישראלי לדמוקרטיה. (2022). </w:t>
-      </w:r>
-      <w:r>
-        <w:rPr>
-          <w:rFonts w:ascii="Times New Roman" w:cs="David" w:hAnsi="Times New Roman"/>
-          <w:i/>
-          <w:iCs/>
-          <w:sz w:val="24"/>
-          <w:szCs w:val="24"/>
-          <w:rtl/>
-        </w:rPr>
-        <w:t xml:space="preserve">התושבים הערבים בערים המעורבות: תמונת מצב</w:t>
-      </w:r>
-      <w:r>
-        <w:rPr>
-          <w:rFonts w:ascii="Times New Roman" w:cs="David" w:hAnsi="Times New Roman"/>
-          <w:sz w:val="24"/>
-          <w:szCs w:val="24"/>
-          <w:rtl/>
-        </w:rPr>
-        <w:t xml:space="preserve">.</w:t>
       </w:r>
     </w:p>
     <w:p>

</xml_diff>

<commit_message>
Align reference list and table with Ono APA 7 guide
Co-Authored-By: Claude Opus 5.5 <noreply@anthropic.com>
Claude-Session: https://claude.ai/code/session_01PCrLuLuf13bgHFN1Akf9GB
</commit_message>
<xml_diff>
--- a/seminar/מטלת ביניים - סקירת ספרות - חיתאם אבו ריאש.docx
+++ b/seminar/מטלת ביניים - סקירת ספרות - חיתאם אבו ריאש.docx
@@ -1474,7 +1474,7 @@
           <w:szCs w:val="24"/>
           <w:rtl/>
         </w:rPr>
-        <w:t xml:space="preserve">אבגר, ע', וייסבלאי, א', שוורץ, ר' ולרר, מ' (2021, 27 במאי). </w:t>
+        <w:t xml:space="preserve">אבגר, ע., וייסבלאי, א., שוורץ, ר., ולרר, מ. (2021, 27 במאי). </w:t>
       </w:r>
       <w:r>
         <w:rPr>
@@ -1511,7 +1511,7 @@
           <w:szCs w:val="24"/>
           <w:rtl/>
         </w:rPr>
-        <w:t xml:space="preserve">אבו עג'אג', א' (2016). מבט השוואתי על נשירה גלויה בקרב מתבגרים במצבי סיכון בחינוך הערבי הבדואי בנגב. </w:t>
+        <w:t xml:space="preserve">אבו עג'אג', א. (2016). מבט השוואתי על נשירה גלויה בקרב מתבגרים במצבי סיכון בחינוך הערבי הבדואי בנגב. </w:t>
       </w:r>
       <w:r>
         <w:rPr>
@@ -1548,7 +1548,7 @@
           <w:szCs w:val="24"/>
           <w:rtl/>
         </w:rPr>
-        <w:t xml:space="preserve">אדם, ר' ובן עוליאל, פ' (2024). הזדהות ומודעות של הורים כלפי בית הספר: השפעתן על תפיסת המחנך כמורה פוליטי ועל היחסים ביניהם. </w:t>
+        <w:t xml:space="preserve">אדם, ר., ובן עוליאל, פ. (2024). הזדהות ומודעות של הורים כלפי בית הספר: השפעתן על תפיסת המחנך כמורה פוליטי ועל היחסים ביניהם. </w:t>
       </w:r>
       <w:r>
         <w:rPr>
@@ -1585,7 +1585,7 @@
           <w:szCs w:val="24"/>
           <w:rtl/>
         </w:rPr>
-        <w:t xml:space="preserve">אחיטוב, ס' והרצוג, א' (2022). "לשבת סביב שולחן עגול ולא מלבני": עמדותיהן של מנהלות מעונות בגיל הרך כלפי פרויקט "בינוי קהילה". </w:t>
+        <w:t xml:space="preserve">אחיטוב, ס., והרצוג, א. (2022). "לשבת סביב שולחן עגול ולא מלבני": עמדותיהן של מנהלות מעונות בגיל הרך כלפי פרויקט "בינוי קהילה". </w:t>
       </w:r>
       <w:r>
         <w:rPr>
@@ -1622,7 +1622,7 @@
           <w:szCs w:val="24"/>
           <w:rtl/>
         </w:rPr>
-        <w:t xml:space="preserve">אליהו-לוי, ד' ורויטר, ע' (2023). מרחב הלמידה החדש בתקופת הקורונה מפגיש בין הבית לכיתה וחושף פערים בחינוך. </w:t>
+        <w:t xml:space="preserve">אליהו-לוי, ד., ורויטר, ע. (2023). מרחב הלמידה החדש בתקופת הקורונה מפגיש בין הבית לכיתה וחושף פערים בחינוך. </w:t>
       </w:r>
       <w:r>
         <w:rPr>
@@ -1659,7 +1659,7 @@
           <w:szCs w:val="24"/>
           <w:rtl/>
         </w:rPr>
-        <w:t xml:space="preserve">ארליך-רון, ר' וגינדי, ש' (2020). שונות ושייכות של מורים חוצי גבולות על רקע עדה ודת. </w:t>
+        <w:t xml:space="preserve">ארליך-רון, ר., וגינדי, ש. (2020). שונות ושייכות של מורים חוצי גבולות על רקע עדה ודת. </w:t>
       </w:r>
       <w:r>
         <w:rPr>
@@ -1696,7 +1696,7 @@
           <w:szCs w:val="24"/>
           <w:rtl/>
         </w:rPr>
-        <w:t xml:space="preserve">בנג'ו, א' ובדיר, ר' (2024). מעורבות הורים וטיב הקשר עם הגננת בתקופת הקורונה: מחקר משווה בין החברה היהודית והחברה הערבית בישראל. </w:t>
+        <w:t xml:space="preserve">בנג'ו, א., ובדיר, ר. (2024). מעורבות הורים וטיב הקשר עם הגננת בתקופת הקורונה: מחקר משווה בין החברה היהודית והחברה הערבית בישראל. </w:t>
       </w:r>
       <w:r>
         <w:rPr>
@@ -1733,7 +1733,7 @@
           <w:szCs w:val="24"/>
           <w:rtl/>
         </w:rPr>
-        <w:t xml:space="preserve">ברוזה, א' וחמו, נ' (2022). תופעת המנהיגות החדשה בקרב מורים בישראל: תפיסות מכוונות ותרגומן לפרקטיקות בשדה. </w:t>
+        <w:t xml:space="preserve">ברוזה, א., וחמו, נ. (2022). תופעת המנהיגות החדשה בקרב מורים בישראל: תפיסות מכוונות ותרגומן לפרקטיקות בשדה. </w:t>
       </w:r>
       <w:r>
         <w:rPr>
@@ -1770,7 +1770,7 @@
           <w:szCs w:val="24"/>
           <w:rtl/>
         </w:rPr>
-        <w:t xml:space="preserve">ברוכי, ת' ואזולאי, ס' (2023). מעורבות הורים בתקופת הקורונה מנקודת מבטם של מנהלי בתי ספר. </w:t>
+        <w:t xml:space="preserve">ברוכי, ת., ואזולאי, ס. (2023). מעורבות הורים בתקופת הקורונה מנקודת מבטם של מנהלי בתי ספר. </w:t>
       </w:r>
       <w:r>
         <w:rPr>
@@ -1807,7 +1807,7 @@
           <w:szCs w:val="24"/>
           <w:rtl/>
         </w:rPr>
-        <w:t xml:space="preserve">ברנע, א' (2024). האותות שהוחמצו והובילו להפתעה אסטרטגית: מהומות ערביי ישראל ב-2021. </w:t>
+        <w:t xml:space="preserve">ברנע, א. (2024). האותות שהוחמצו והובילו להפתעה אסטרטגית: מהומות ערביי ישראל ב-2021. </w:t>
       </w:r>
       <w:r>
         <w:rPr>
@@ -1844,7 +1844,7 @@
           <w:szCs w:val="24"/>
           <w:rtl/>
         </w:rPr>
-        <w:t xml:space="preserve">גולדרט, מ' (2024). "העוגן, המצפן וההגה בתוך ים סוער": החוסן הערכי של החינוך החברתי-קהילתי בעת משבר הקורונה. </w:t>
+        <w:t xml:space="preserve">גולדרט, מ. (2024). "העוגן, המצפן וההגה בתוך ים סוער": החוסן הערכי של החינוך החברתי-קהילתי בעת משבר הקורונה. </w:t>
       </w:r>
       <w:r>
         <w:rPr>
@@ -1881,7 +1881,7 @@
           <w:szCs w:val="24"/>
           <w:rtl/>
         </w:rPr>
-        <w:t xml:space="preserve">גולדרט, מ' ועמרם-אשרוב, ע' (2023). בין ציר השינוי לציר ההעצמה: מיזמי החינוך הבלתי פורמלי בעת מגפת הקורונה. </w:t>
+        <w:t xml:space="preserve">גולדרט, מ., ועמרם-אשרוב, ע. (2023). בין ציר השינוי לציר ההעצמה: מיזמי החינוך הבלתי פורמלי בעת מגפת הקורונה. </w:t>
       </w:r>
       <w:r>
         <w:rPr>
@@ -1918,7 +1918,7 @@
           <w:szCs w:val="24"/>
           <w:rtl/>
         </w:rPr>
-        <w:t xml:space="preserve">וול, א' ובליט-כהן, ע' (2023). משמעויות של קהילה בשכונה בעיר בעידן החדש. </w:t>
+        <w:t xml:space="preserve">וול, א., ובליט-כהן, ע. (2023). משמעויות של קהילה בשכונה בעיר בעידן החדש. </w:t>
       </w:r>
       <w:r>
         <w:rPr>
@@ -1955,7 +1955,7 @@
           <w:szCs w:val="24"/>
           <w:rtl/>
         </w:rPr>
-        <w:t xml:space="preserve">טרגר-סודרי, ש', רוזנברג, ח', סבג בן פורת, ח' ולוינשטיין, ה' (2025). "אספת הורים אצלי בסמרטפון": רשת הווטסאפ כפלטפורמה לתקשורת דיגיטלית בין הורים למורים. </w:t>
+        <w:t xml:space="preserve">טרגר-סודרי, ש., רוזנברג, ח., סבג בן פורת, ח., ולוינשטיין, ה. (2025). "אספת הורים אצלי בסמרטפון": רשת הווטסאפ כפלטפורמה לתקשורת דיגיטלית בין הורים למורים. </w:t>
       </w:r>
       <w:r>
         <w:rPr>
@@ -1992,7 +1992,7 @@
           <w:szCs w:val="24"/>
           <w:rtl/>
         </w:rPr>
-        <w:t xml:space="preserve">כהן, א', בארט, ע' וצמח, ס' (2026). סגנונות מנהיגות של מנהלי בתי ספר כמנבאים התנהגות אזרחית ארגונית של מורים. </w:t>
+        <w:t xml:space="preserve">כהן, א., בארט, ע., וצמח, ס. (2026). סגנונות מנהיגות של מנהלי בתי ספר כמנבאים התנהגות אזרחית ארגונית של מורים. </w:t>
       </w:r>
       <w:r>
         <w:rPr>
@@ -2029,7 +2029,7 @@
           <w:szCs w:val="24"/>
           <w:rtl/>
         </w:rPr>
-        <w:t xml:space="preserve">כורם, ע' (2022). שותפות בין אנשי חינוך להורים בפיתוח כשירות חברתית של תלמידים: נקודות למחשבה בעבודתן של יועצות חינוכיות. </w:t>
+        <w:t xml:space="preserve">כורם, ע. (2022). שותפות בין אנשי חינוך להורים בפיתוח כשירות חברתית של תלמידים: נקודות למחשבה בעבודתן של יועצות חינוכיות. </w:t>
       </w:r>
       <w:r>
         <w:rPr>
@@ -2066,7 +2066,7 @@
           <w:szCs w:val="24"/>
           <w:rtl/>
         </w:rPr>
-        <w:t xml:space="preserve">מלץ, ט', זוהר, י', ודר-וייס, ד' ודישון, ג' (2026). כיצד סימולציות קליניות תומכות באימוץ נקודת המבט של ההורים בשיח מורות. </w:t>
+        <w:t xml:space="preserve">מלץ, ט., זוהר, י., ודר-וייס, ד., ודישון, ג. (2026). כיצד סימולציות קליניות תומכות באימוץ נקודת המבט של ההורים בשיח מורות. </w:t>
       </w:r>
       <w:r>
         <w:rPr>
@@ -2103,7 +2103,7 @@
           <w:szCs w:val="24"/>
           <w:rtl/>
         </w:rPr>
-        <w:t xml:space="preserve">עזריה וצר, א', גרינשטיין, י' ודרור, י' (2024). הכשרת מורים להתמודדות עם מעורבות הורים בבית ספר: נקודת המבט של מורים חדשים ומורים חונכים. </w:t>
+        <w:t xml:space="preserve">עזריה וצר, א., גרינשטיין, י., ודרור, י. (2024). הכשרת מורים להתמודדות עם מעורבות הורים בבית ספר: נקודת המבט של מורים חדשים ומורים חונכים. </w:t>
       </w:r>
       <w:r>
         <w:rPr>
@@ -2140,7 +2140,7 @@
           <w:szCs w:val="24"/>
           <w:rtl/>
         </w:rPr>
-        <w:t xml:space="preserve">ענבר-פירסט, ח', יריב, א' ואייבזו, ש' (2023). תלמידאות לקויה כמקרה מבחן ליחסי מורים-הורים. </w:t>
+        <w:t xml:space="preserve">ענבר-פירסט, ח., יריב, א., ואייבזו, ש. (2023). תלמידאות לקויה כמקרה מבחן ליחסי מורים-הורים. </w:t>
       </w:r>
       <w:r>
         <w:rPr>
@@ -2177,7 +2177,7 @@
           <w:szCs w:val="24"/>
           <w:rtl/>
         </w:rPr>
-        <w:t xml:space="preserve">צמח, ס' ובארט, ע' (2024). סגנונות מנהיגות של מנהלי בתי ספר כמנבאים הפחתת שחיקת מורים בישראל. </w:t>
+        <w:t xml:space="preserve">צמח, ס., ובארט, ע. (2024). סגנונות מנהיגות של מנהלי בתי ספר כמנבאים הפחתת שחיקת מורים בישראל. </w:t>
       </w:r>
       <w:r>
         <w:rPr>
@@ -2214,7 +2214,7 @@
           <w:szCs w:val="24"/>
           <w:rtl/>
         </w:rPr>
-        <w:t xml:space="preserve">שמריהו-ישורון, י' (2021). המוסר הכפול של הדו-קיום: אתנו-ג'נטריפיקציה בערים המעורבות. </w:t>
+        <w:t xml:space="preserve">שמריהו-ישורון, י. (2021). המוסר הכפול של הדו-קיום: אתנו-ג'נטריפיקציה בערים המעורבות. </w:t>
       </w:r>
       <w:r>
         <w:rPr>

</xml_diff>

<commit_message>
Correct sources against six more full-text articles
Co-Authored-By: Claude Opus 5.5 <noreply@anthropic.com>
Claude-Session: https://claude.ai/code/session_01PCrLuLuf13bgHFN1Akf9GB
</commit_message>
<xml_diff>
--- a/seminar/מטלת ביניים - סקירת ספרות - חיתאם אבו ריאש.docx
+++ b/seminar/מטלת ביניים - סקירת ספרות - חיתאם אבו ריאש.docx
@@ -712,7 +712,7 @@
           <w:szCs w:val="24"/>
           <w:rtl/>
         </w:rPr>
-        <w:t xml:space="preserve">קהילה היא מושג שקל להשתמש בו וקשה להגדיר אותו. ההגדרות המסורתיות קשרו קהילה לטריטוריה משותפת, לשכונה או ליישוב, אולם בעיר המודרנית המגורים באותו מקום אינם מבטיחים קשר בין התושבים. מחקר איכותני שנערך בשכונת פסגת זאב בירושלים, ובו ראיונות עומק חצי מובנים עם 15 תושבים בני 25 עד 55, בחן כיצד התושבים תופסים את הקהילה בשכונה, את תחושת השייכות שלהם, את ההתקשרות שלהם למקום ואת ציפיותיהם מן הממסד בתחום החברתי. אחת התמות המרכזיות שעלו בו תיארה את משמעות הקהילה כרצף שנע בין "היעדר" ובין "נוכחות" (וול ובליט-כהן, 2023). כלומר, קהילה אינה נתון קבוע של המקום. היא חוויה שהתושבים מרגישים במידה זו או אחרת.</w:t>
+        <w:t xml:space="preserve">קהילה היא מושג שקל להשתמש בו וקשה להגדיר אותו. ההגדרות המסורתיות קשרו קהילה לטריטוריה משותפת, לשכונה או ליישוב, אולם בעיר המודרנית המגורים באותו מקום אינם מבטיחים קשר בין התושבים. מחקר איכותני שנערך בשכונת פסגת זאב בירושלים, ובו ראיונות עומק חצי מובנים עם 15 תושבים בני 25 עד 55, בחן כיצד התושבים תופסים את הקהילה בשכונה, את תחושת השייכות שלהם, את ההתקשרות שלהם למקום ואת ציפיותיהם מן הממסד בתחום החברתי. אחת מארבע התמות שעלו בו תיארה את משמעות הקהילה בשכונה כרצף שבין היעדר קהילה, געגוע אליה וניסיון לשחזר אותה (וול-טיסר ובליט-כהן, 2023). כלומר, קהילה אינה נתון קבוע של המקום. היא חוויה שהתושבים מרגישים במידה זו או אחרת.</w:t>
       </w:r>
     </w:p>
     <w:p>
@@ -816,24 +816,24 @@
           <w:szCs w:val="24"/>
           <w:rtl/>
         </w:rPr>
-        <w:t xml:space="preserve">הקשר בין בית הספר לקהילה בולט במיוחד בעתות משבר. מחקר שעסק בצוותי החינוך החברתי-קהילתי שהמשיכו לפעול בתקופת הקורונה מצא כי אנשי הצוות תיארו את המצב באמצעות מטאפורות של ים סוער, ואת החינוך החברתי-קהילתי עצמו כ"עוגן", "מצפן" ו"הגה". שלושת הדימויים נקשרו לשלושת הרכיבים של תחושת הקוהרנטיות: המובנות, המשמעותיות והיכולת לנהל את המצב (גולדרט, 2024). המשמעות היא שהפעילות הקהילתית במסגרות החינוך אינה תוספת, ובזמן משבר היא אחד המקורות לחוסן של הצוות ושל המשתתפים.</w:t>
-      </w:r>
-    </w:p>
-    <w:p>
-      <w:pPr>
-        <w:bidi/>
-        <w:spacing w:after="0" w:before="0" w:line="480" w:lineRule="auto"/>
-        <w:ind w:firstLine="567"/>
-        <w:jc w:val="both"/>
-      </w:pPr>
-      <w:r>
-        <w:rPr>
-          <w:rFonts w:ascii="Times New Roman" w:cs="David" w:hAnsi="Times New Roman"/>
-          <w:sz w:val="24"/>
-          <w:szCs w:val="24"/>
-          <w:rtl/>
-        </w:rPr>
-        <w:t xml:space="preserve">שאלת השייכות לקהילת בית הספר מקבלת משקל מיוחד בבתי ספר מגוונים. מחקר שכלל סקר ארצי מקוון בקרב כ-1,600 מורים בחן מורים "חוצי גבולות", כלומר מורים המלמדים בבית ספר שאופיו התרבותי, העדתי או הדתי שונה מזה של הקבוצה שאליה הם משתייכים. לא נמצא הבדל במסוגלות הארגונית בינם ובין מורים מקבוצת הרוב. מורים בשתי הקבוצות ראו בעצמם נציגים של הקהילות שמהן הם באים, ותחושת השייכות לבית הספר ניבאה את שביעות הרצון שלהם מהעבודה (ארליך-רון וגינדי, 2020). הממצא חשוב לעיר מעורבת כמו לוד, שבה המורה, התלמיד וההורה אינם תמיד בני אותה קהילה.</w:t>
+        <w:t xml:space="preserve">הקשר בין בית הספר לקהילה בולט במיוחד בעתות משבר. מחקר שבחן, באמצעות שאלון פתוח, את משאבי ההתמודדות של 69 מדריכי חינוך חברתי-קהילתי שהמשיכו לפעול בתקופת הקורונה מצא כי ההתמודדות שלהם נבנתה כתחושת קוהרנטיות. אחת המשתתפות תיארה את החינוך החברתי-קהילתי כ"העוגן, המצפן וההגה בתוך ים סוער". לפי החוקרת, העוגן מבטא מובנות, המצפן מבטא משמעותיות וההגה מבטא נהילות (גולדרט, 2024). המשמעות היא שהפעילות הקהילתית במסגרות החינוך אינה תוספת, ובזמן משבר היא אחד המקורות לחוסן של הצוות ושל המשתתפים.</w:t>
+      </w:r>
+    </w:p>
+    <w:p>
+      <w:pPr>
+        <w:bidi/>
+        <w:spacing w:after="0" w:before="0" w:line="480" w:lineRule="auto"/>
+        <w:ind w:firstLine="567"/>
+        <w:jc w:val="both"/>
+      </w:pPr>
+      <w:r>
+        <w:rPr>
+          <w:rFonts w:ascii="Times New Roman" w:cs="David" w:hAnsi="Times New Roman"/>
+          <w:sz w:val="24"/>
+          <w:szCs w:val="24"/>
+          <w:rtl/>
+        </w:rPr>
+        <w:t xml:space="preserve">שאלת השייכות לקהילת בית הספר מקבלת משקל מיוחד בבתי ספר מגוונים. מחקר שיטות מעורבות, שהיה חלק מסקר ארצי מקוון בקרב כ-1,600 מורים, בחן מורים "חוצי גבולות": 56 מורים דתיים בבתי ספר חילוניים ו-41 מורים ממוצא עדתי שונה מרוב חדר המורים. לא נמצא הבדל במסוגלות הארגונית בינם ובין מורים מקבוצת הרוב, ומורים בשתי הקבוצות ראו בעצמם נציגים של הקהילות שמהן הם באים. לתחושת השייכות תרמו החיבור המקצועי, העבודה המשותפת עם התלמידים, התמיכה בחדר המורים ואירועים חגיגיים (ארליך-רון וגינדי, 2020). הממצא חשוב לעיר מעורבת כמו לוד, שבה המורה, התלמיד וההורה אינם תמיד בני אותה קהילה.</w:t>
       </w:r>
     </w:p>
     <w:p>
@@ -923,7 +923,7 @@
           <w:szCs w:val="24"/>
           <w:rtl/>
         </w:rPr>
-        <w:t xml:space="preserve">מחקרים בישראל בחנו את תרומתה של מנהיגות משתפת לעבודת המורים. מחקר כמותי שנערך בקרב 1,992 מורים בדק שלושה סגנונות מנהיגות של מנהלים, מנהיגות משתפת, מנהיגות מעצבת ומנהיגות אותנטית, כמנבאים של התנהגות אזרחית ארגונית, כלומר נכונות של המורים לפעול מעבר לדרישות התפקיד הפורמליות. המנהיגות המשתפת נמצאה המנבא החזק ביותר, לפני המנהיגות האותנטית, ואילו המנהיגות המעצבת ניבאה מעט בלבד (כהן ואחרים, 2026). מחקר נוסף של אותה קבוצת חוקרים בחן את סגנונות המנהיגות של המנהלים, ובהם מנהיגות מבוזרת, כמנבאים של הפחתת שחיקה בקרב מורים בישראל (צמח ובארט, 2024). שני המחקרים מצביעים על כך שהדרך שבה המנהל משתף את המורים משפיעה על האנרגיה שהם מוכנים להשקיע בעבודה, ובכללה בעבודה מול ההורים, שאינה מוגדרת עד הסוף בשום תפקיד.</w:t>
+        <w:t xml:space="preserve">מחקרים בישראל בחנו את תרומתה של מנהיגות משתפת לעבודת המורים. מחקר כמותי שנערך בקרב 1,992 מורים בדק שלושה סגנונות מנהיגות של מנהלים, מנהיגות משתפת, מנהיגות מעצבת ומנהיגות אותנטית, כמנבאים של התנהגות אזרחית ארגונית, כלומר נכונות של המורים לפעול מעבר לדרישות התפקיד הפורמליות. המנהיגות המשתפת נמצאה המנבא המרכזי, והסבירה 30% מהשונות. המנהיגות האותנטית הוסיפה 0.3% בלבד, והמנהיגות המעצבת לא ניבאה התנהגות אזרחית ארגונית כלל (קאהן ואחרים, 2026). מחקר נוסף, בקרב 2,234 מורים, מצא כי מנהיגות אותנטית של המנהל היא היעילה ביותר בהפחתת שחיקת מורים, ואילו מנהיגות מעצבת ומנהיגות הוראתית קשורות לשחיקה נמוכה יותר אך אינן מנבאות את הפחתתה (צמח ובארט, 2024). שני המחקרים מצביעים על כך שהדרך שבה המנהל משתף את המורים משפיעה על האנרגיה שהם מוכנים להשקיע בעבודה, ובכללה בעבודה מול ההורים, שאינה מוגדרת עד הסוף בשום תפקיד.</w:t>
       </w:r>
     </w:p>
     <w:p>
@@ -976,7 +976,7 @@
           <w:szCs w:val="24"/>
           <w:rtl/>
         </w:rPr>
-        <w:t xml:space="preserve">היחסים עם ההורים הם אחד התחומים שבהם מנהיגות בית הספר נבחנת בפועל. מחקר איכותני שכלל ראיונות עומק חצי מובנים עם עשרה מנהלי בתי ספר יסודיים וחטיבות ביניים בחן כיצד ראו המנהלים את מעורבות ההורים בתקופת הקורונה. המנהלים תיארו שינוי משמעותי באופי המעורבות, וייחסו אותו לכך שזירת הבית וזירת בית הספר התערבבו זו בזו. בתי הספר הגיבו באסטרטגיה מכוונת של שקיפות ופתיחות, שהתחשבה בקשיים ובצרכים של ההורים. עם זאת, החוקרות הסיקו כי האופן שבו המנהלים תופסים סוג מסוים של מעורבות אינו מבטיח שהמעורבות תהיה יעילה (ברוכי ואזולאי, 2023). המנהל קובע את הטון, אבל אינו יכול לנהל לבדו את הקשר היומיומי עם מאות משפחות.</w:t>
+        <w:t xml:space="preserve">היחסים עם ההורים הם אחד התחומים שבהם מנהיגות בית הספר נבחנת בפועל. מחקר איכותני שכלל ראיונות עומק חצי מובנים עם שנים עשר מנהלי בתי ספר יסודיים וחטיבות ביניים בחן כיצד ראו המנהלים את מעורבות ההורים בתקופת הקורונה. המנהלים תיארו שינוי משמעותי באופי המעורבות, וייחסו אותו לכך שזירת הבית וזירת בית הספר התערבבו זו בזו. בתי הספר הגיבו באסטרטגיה מכוונת של שקיפות ופתיחות, שהתחשבה בקשיים ובצרכים של ההורים. לתפיסת המנהלים, סוג המעורבות שנוצר לא היה בהכרח יעיל ומקדם (ברוכי ואזולאי, 2023). המנהל קובע את הטון, אבל אינו יכול לנהל לבדו את הקשר היומיומי עם מאות משפחות.</w:t>
       </w:r>
     </w:p>
     <w:p>
@@ -1420,7 +1420,7 @@
           <w:szCs w:val="24"/>
           <w:rtl/>
         </w:rPr>
-        <w:t xml:space="preserve">הסקירה התחילה במושג הרחב של קהילה, שאינה נתון קבוע אלא חוויה שנעה בין היעדר לנוכחות (וול ובליט-כהן, 2023), והמשיכה בבית הספר כקהילה שהשייכות אליה ניבאה את שביעות רצונם של המורים (ארליך-רון וגינדי, 2020). מנהיגות משתפת נמצאה קשורה לנכונות של מורים לפעול מעבר לתפקידם (כהן ואחרים, 2026), אך הקשר היומיומי עם ההורים נשען בעיקר על המורים, שלעיתים קרובות פועלים בתחום הזה באופן אינטואיטיבי (עזריה וצר ואחרים, 2024). הספרות על השותפות עצמה מצביעה על תרומה חיובית אך מתונה של מעורבות ההורים (Erdem &amp; Kaya, 2020), על ערוצים דיגיטליים מהירים שמטשטשים גבולות (טרגר-סודרי ואחרים, 2025) ועל פער בציפיות בין מורים להורים (Fisher &amp; Baissberg, 2025).</w:t>
+        <w:t xml:space="preserve">הסקירה התחילה במושג הרחב של קהילה, שאינה נתון קבוע אלא חוויה שנעה בין היעדר, געגוע וניסיון לשחזור (וול-טיסר ובליט-כהן, 2023), והמשיכה בבית הספר כקהילה שתחושת השייכות אליה נשענת על החיבור המקצועי ועל התמיכה בחדר המורים (ארליך-רון וגינדי, 2020). מנהיגות משתפת נמצאה קשורה לנכונות של מורים לפעול מעבר לתפקידם (קאהן ואחרים, 2026), אך הקשר היומיומי עם ההורים נשען בעיקר על המורים, שלעיתים קרובות פועלים בתחום הזה באופן אינטואיטיבי (עזריה וצר ואחרים, 2024). הספרות על השותפות עצמה מצביעה על תרומה חיובית אך מתונה של מעורבות ההורים (Erdem &amp; Kaya, 2020), על ערוצים דיגיטליים מהירים שמטשטשים גבולות (טרגר-סודרי ואחרים, 2025) ועל פער בציפיות בין מורים להורים (Fisher &amp; Baissberg, 2025).</w:t>
       </w:r>
     </w:p>
     <w:p>
@@ -1918,7 +1918,7 @@
           <w:szCs w:val="24"/>
           <w:rtl/>
         </w:rPr>
-        <w:t xml:space="preserve">וול, א., ובליט-כהן, ע. (2023). משמעויות של קהילה בשכונה בעיר בעידן החדש. </w:t>
+        <w:t xml:space="preserve">וול-טיסר, א., ובליט-כהן, ע. (2023). משמעויות של קהילה בשכונה בעיר בעידן החדש. </w:t>
       </w:r>
       <w:r>
         <w:rPr>
@@ -1992,7 +1992,7 @@
           <w:szCs w:val="24"/>
           <w:rtl/>
         </w:rPr>
-        <w:t xml:space="preserve">כהן, א., בארט, ע., וצמח, ס. (2026). סגנונות מנהיגות של מנהלי בתי ספר כמנבאים התנהגות אזרחית ארגונית של מורים. </w:t>
+        <w:t xml:space="preserve">קאהן, א., בארט, ע., וצמח, ס. (2026). סגנונות מנהיגות של מנהלי בתי ספר כמנבאים התנהגות אזרחית ארגונית של מורים. </w:t>
       </w:r>
       <w:r>
         <w:rPr>

</xml_diff>